<commit_message>
DIP-18: Add pull request reference to supervisor feedback
</commit_message>
<xml_diff>
--- a/docs/supervisor-feedback/PII_Gateway_Supervisor_feedback_EN_team_decisions.docx
+++ b/docs/supervisor-feedback/PII_Gateway_Supervisor_feedback_EN_team_decisions.docx
@@ -704,6 +704,13 @@
               </w:rPr>
               <w:t xml:space="preserve">PR: </w:t>
             </w:r>
+            <w:r>
+              <w:rPr>
+                <w:i/>
+                <w:sz w:val="18"/>
+              </w:rPr>
+              <w:t>PR #18 (DIP-5, DIP-12, DIP-16, DIP-18); README — DIP-19 pull request</w:t>
+            </w:r>
           </w:p>
         </w:tc>
       </w:tr>
@@ -992,6 +999,13 @@
               </w:rPr>
               <w:t xml:space="preserve">PR: </w:t>
             </w:r>
+            <w:r>
+              <w:rPr>
+                <w:i/>
+                <w:sz w:val="18"/>
+              </w:rPr>
+              <w:t>to be added after DIP-20, DIP-21</w:t>
+            </w:r>
           </w:p>
         </w:tc>
       </w:tr>
@@ -1254,6 +1268,13 @@
               </w:rPr>
               <w:t xml:space="preserve">PR: </w:t>
             </w:r>
+            <w:r>
+              <w:rPr>
+                <w:i/>
+                <w:sz w:val="18"/>
+              </w:rPr>
+              <w:t>to be added after DIP-22</w:t>
+            </w:r>
           </w:p>
         </w:tc>
       </w:tr>
@@ -1542,6 +1563,13 @@
               </w:rPr>
               <w:t xml:space="preserve">PR: </w:t>
             </w:r>
+            <w:r>
+              <w:rPr>
+                <w:i/>
+                <w:sz w:val="18"/>
+              </w:rPr>
+              <w:t>to be added after DIP-23</w:t>
+            </w:r>
           </w:p>
         </w:tc>
       </w:tr>
@@ -1812,6 +1840,13 @@
                 <w:sz w:val="18"/>
               </w:rPr>
               <w:t xml:space="preserve">PR: </w:t>
+            </w:r>
+            <w:r>
+              <w:rPr>
+                <w:i/>
+                <w:sz w:val="18"/>
+              </w:rPr>
+              <w:t>to be added after DIP-24</w:t>
             </w:r>
           </w:p>
         </w:tc>

</xml_diff>